<commit_message>
Sincronización normativa nacional 2026-09-04
</commit_message>
<xml_diff>
--- a/documentos/vigencia/Reporte_vigencia_cartografica_IPT.docx
+++ b/documentos/vigencia/Reporte_vigencia_cartografica_IPT.docx
@@ -17,7 +17,7 @@
         </w:rPr>
         <w:t>Departamento de Estudios Inmobiliarios · Transsa</w:t>
         <w:br/>
-        <w:t>Generado: 2026-09-03 13:38</w:t>
+        <w:t>Generado: 2026-09-04 09:56</w:t>
       </w:r>
     </w:p>
     <w:p>
@@ -30,7 +30,80 @@
     </w:p>
     <w:p>
       <w:r>
-        <w:t>Se evaluaron 0 instrumentos o líneas normativas. Desactualizados: 0; revisión necesaria: 0; sin cartografía: 0.</w:t>
+        <w:t>Se evaluaron 1 instrumentos o líneas normativas. Desactualizados: 0; revisión necesaria: 0; sin cartografía: 1.</w:t>
+      </w:r>
+    </w:p>
+    <w:p>
+      <w:pPr>
+        <w:pStyle w:val="Heading1"/>
+      </w:pPr>
+      <w:r>
+        <w:t>Quinta Normal · PRC · PRC</w:t>
+      </w:r>
+    </w:p>
+    <w:p>
+      <w:r>
+        <w:rPr>
+          <w:b/>
+        </w:rPr>
+        <w:t xml:space="preserve">Región: </w:t>
+      </w:r>
+      <w:r>
+        <w:t>Metropolitana de Santiago</w:t>
+      </w:r>
+    </w:p>
+    <w:p>
+      <w:r>
+        <w:rPr>
+          <w:b/>
+        </w:rPr>
+        <w:t xml:space="preserve">Estado: </w:t>
+      </w:r>
+      <w:r>
+        <w:t>Sin cartografía</w:t>
+      </w:r>
+    </w:p>
+    <w:p>
+      <w:r>
+        <w:rPr>
+          <w:b/>
+        </w:rPr>
+        <w:t xml:space="preserve">Confianza: </w:t>
+      </w:r>
+      <w:r>
+        <w:t>alta</w:t>
+      </w:r>
+    </w:p>
+    <w:p>
+      <w:r>
+        <w:t>Existe una línea normativa, pero no hay una versión cartográfica registrada para comparar.</w:t>
+      </w:r>
+    </w:p>
+    <w:p>
+      <w:pPr>
+        <w:pStyle w:val="Heading2"/>
+      </w:pPr>
+      <w:r>
+        <w:t>Línea de tiempo</w:t>
+      </w:r>
+    </w:p>
+    <w:p>
+      <w:pPr>
+        <w:pStyle w:val="ListBullet"/>
+      </w:pPr>
+      <w:r>
+        <w:rPr>
+          <w:b/>
+        </w:rPr>
+        <w:t>2026-09-04 · Enmienda · Enmienda</w:t>
+      </w:r>
+      <w:r>
+        <w:t xml:space="preserve"> — sin verificar</w:t>
+      </w:r>
+    </w:p>
+    <w:p>
+      <w:r>
+        <w:t>Extracto de decreto alcaldicio número 1.608, de 2026.- Promulga enmiendas al Plan Regulador Comunal</w:t>
       </w:r>
     </w:p>
     <w:p>

</xml_diff>